<commit_message>
Entregables al dia, desde el commit 4890eb3 del repositorio de trabajo
</commit_message>
<xml_diff>
--- a/ENTREGA FINAL/04 - Manuales/5 - Manual de programador.docx
+++ b/ENTREGA FINAL/04 - Manuales/5 - Manual de programador.docx
@@ -951,7 +951,7 @@
           <w:rFonts w:ascii="Consolas" w:hAnsi="Consolas" w:eastAsia="Consolas"/>
           <w:sz w:val="19"/>
         </w:rPr>
-        <w:t>│   └─ PredictIT.Tests/        361 pruebas</w:t>
+        <w:t>│   └─ PredictIT.Tests/        362 pruebas</w:t>
       </w:r>
     </w:p>
     <w:p>
@@ -4988,7 +4988,7 @@
     </w:p>
     <w:p>
       <w:r>
-        <w:t>361 pruebas del backend y 91 del frontend.</w:t>
+        <w:t>362 pruebas del backend y 91 del frontend.</w:t>
       </w:r>
     </w:p>
     <w:tbl>

</xml_diff>